<commit_message>
feat: expand research library with infrastructure studies, architecture documentation, and foundational content updates
</commit_message>
<xml_diff>
--- a/docs/Algorapolis.docx
+++ b/docs/Algorapolis.docx
@@ -93,7 +93,7 @@
           <w:noProof/>
         </w:rPr>
         <w:drawing>
-          <wp:anchor distT="0" distB="0" distL="114300" distR="114300" simplePos="0" relativeHeight="251658752" behindDoc="1" locked="0" layoutInCell="1" allowOverlap="1" wp14:anchorId="6B2BA098" wp14:editId="3FA360C2">
+          <wp:anchor distT="0" distB="0" distL="114300" distR="114300" simplePos="0" relativeHeight="251658752" behindDoc="1" locked="0" layoutInCell="1" allowOverlap="1" wp14:anchorId="6B2BA098" wp14:editId="4797409B">
             <wp:simplePos x="0" y="0"/>
             <wp:positionH relativeFrom="column">
               <wp:posOffset>1905</wp:posOffset>
@@ -6561,6 +6561,1544 @@
     <w:p>
       <w:r>
         <w:t>The implementation of the Emotional Intelligence Layer follows a phased approach. Phase 1 (Years 1-2): Establish the Ubuntu-Adapted Well-Being Instrument and begin periodic well-being surveys; deploy the CESL in pilot districts with federated sentiment analysis; constitute the HERB's Expert Chamber. Phase 2 (Years 3-4): Expand CESL to national coverage; deploy the Cultural Preservation Layer with Cultural Impact Assessment for major policies; constitute the Citizen Chamber and Elders Chamber; deploy the EIL for all high-impact SLE decisions. Phase 3 (Years 5-7): Full integration of the Emotional Intelligence Layer with the National Digital Twin and governance visualization systems; continuous calibration of emotional models across Tanzania's cultural diversity; international interoperability of emotional governance frameworks. The estimated investment is $8-15 million for Phase 1, $20-35 million for Phase 2, and $15-25 million for Phase 3. This investment is not discretionary; it is the cost of ensuring that Algorapolis's computational power serves humanity rather than replacing it. Emotional intelligence is not optional infrastructure. It is governance stability infrastructure. The civilization that builds Algorapolis without the Emotional Intelligence Layer will have built a machine that works perfectly but means nothing. The civilization that builds it with the Emotional Intelligence Layer will have built an instrument worthy of the humans it serves.</w:t>
+      </w:r>
+    </w:p>
+    <w:p>
+      <w:pPr>
+        <w:pStyle w:val="Heading1"/>
+      </w:pPr>
+      <w:r>
+        <w:t>PART XIV: ENCLAVE FORMATION, HUMAN INFRASTRUCTURE, AND CIVILIZATIONAL COHESION</w:t>
+      </w:r>
+    </w:p>
+    <w:p>
+      <w:r>
+        <w:t>This part examines one of the most dangerous long-term risks facing Algorapolis and other advanced governance systems: the Enclave Problem. The objective is to understand how highly successful regions, cities, communities, corporations, digital networks, or special economic zones can become disconnected from the larger civilization they exist within, eventually creating instability, exclusion, fragmentation, or collapse. This is not a theoretical concern. It is a documented, recurring pattern across history and across the globe — from the resource-cursed nations of sub-Saharan Africa to the gleaming but hollow smart cities of the developing world, from the migrant labor enclaves of the Gulf states to the algorithmically segregated digital communities of the twenty-first century. Every case shares a common structure: physical, economic, or technological infrastructure develops faster than the human and institutional capacity to sustain it, creating systems that appear successful but are fundamentally fragile. Algorapolis, as a civilization architecture, must address this risk at the architectural level — not as an afterthought, but as a constitutional constraint on how development proceeds.</w:t>
+      </w:r>
+    </w:p>
+    <w:p>
+      <w:pPr>
+        <w:pStyle w:val="Heading2"/>
+      </w:pPr>
+      <w:r>
+        <w:t>Section 78: The Enclave Problem — Success Without Integration</w:t>
+      </w:r>
+    </w:p>
+    <w:p>
+      <w:pPr>
+        <w:pStyle w:val="Heading3"/>
+      </w:pPr>
+      <w:r>
+        <w:t>78.1 Definition and Scope</w:t>
+      </w:r>
+    </w:p>
+    <w:p>
+      <w:r>
+        <w:t>An enclave is a highly developed and self-sustaining system that becomes increasingly disconnected from its surrounding society. Examples include Special Economic Zones (SEZs), smart cities, wealthy urban districts, corporate ecosystems, digital communities, religious communities, gated societies, autonomous regions with asymmetric development, extractive industry compounds, and future planetary settlements. The danger is not success. The danger is success without integration. When an enclave prospers while its surrounding civilization stagnates, it creates a dual structure: one world with infrastructure, opportunity, and agency; another world without. This dual structure is inherently unstable. Over time, the enclave either becomes a fortress (protecting its advantage through exclusion) or a parasite (extracting resources from the surrounding society without reciprocal contribution). Neither outcome is compatible with civilizational longevity.</w:t>
+      </w:r>
+    </w:p>
+    <w:p>
+      <w:pPr>
+        <w:pStyle w:val="Heading3"/>
+      </w:pPr>
+      <w:r>
+        <w:t>78.2 The Five-Stage Formation Pattern</w:t>
+      </w:r>
+    </w:p>
+    <w:p>
+      <w:r>
+        <w:t>Enclave formation follows a recognizable structural pattern that can be described in five stages. Stage 1 — Concentration: Resources, talent, and investment flow into a specific zone or community, creating rapid development that outpaces the surrounding region. This is often intentional and appears beneficial. Stage 2 — Divergence: The enclave develops its own institutions, culture, economic logic, and social networks that begin to diverge from the surrounding society. The divergence is often invisible to enclave residents. Stage 3 — Self-Sufficiency: The enclave reaches a threshold where it no longer depends on the surrounding society for essential functions, and the incentive to maintain connections diminishes. Stage 4 — Extraction or Fortress: The enclave either extracts resources without proportional contribution, or fortifies itself through walls, gates, access controls, and legal exemptions. These are not mutually exclusive. Stage 5 — Fragility or Conflict: The dual structure becomes unsustainable — the surrounding society resents the enclave, the enclave discovers its self-sufficiency was illusory, or external shocks reveal the interdependence that both sides had ignored.</w:t>
+      </w:r>
+    </w:p>
+    <w:p>
+      <w:pPr>
+        <w:pStyle w:val="Heading3"/>
+      </w:pPr>
+      <w:r>
+        <w:t>78.3 The Academic Foundation</w:t>
+      </w:r>
+    </w:p>
+    <w:p>
+      <w:r>
+        <w:t>The enclave problem intersects several established academic traditions. Enclave Economy Theory, documented by Farole (2011) and Zeng (2016), describes economic zones that generate growth within their boundaries but fail to stimulate broader development. Resource Curse Theory, documented by Sachs and Warner (1995, 2001), demonstrates the paradox that resource-rich countries often experience slower growth, worse governance, and greater inequality. Dutch Disease, described by Corden and Neary (1982), shows how booming extractive sectors can deindustrialize an economy by creating structural imbalance. Paul Collier's The Bottom Billion (2007) identifies four traps that keep the poorest countries poor — conflict, natural resource curse, landlocked geography, and bad governance — and three of these four traps are directly connected to enclave dynamics. Elinor Ostrom's polycentric governance framework provides theoretical tools for understanding multiple decision-making centers, but assumes communication between centers — an assumption that enclaves, by definition, break. Social Cohesion Theory, as defined by Chan, To, and Chan (2006), measures the degree of connectedness and solidarity among groups, and when cohesion breaks down, the result is structural fragility that makes the entire system vulnerable to shocks.</w:t>
+      </w:r>
+    </w:p>
+    <w:p>
+      <w:pPr>
+        <w:pStyle w:val="Heading2"/>
+      </w:pPr>
+      <w:r>
+        <w:t>Section 79: The SEZ Failure Mode — Infrastructure Without Humans</w:t>
+      </w:r>
+    </w:p>
+    <w:p>
+      <w:pPr>
+        <w:pStyle w:val="Heading3"/>
+      </w:pPr>
+      <w:r>
+        <w:t>79.1 The Empirical Record of SEZ Failures</w:t>
+      </w:r>
+    </w:p>
+    <w:p>
+      <w:r>
+        <w:t>The World Bank estimates that there are over 5,400 SEZs worldwide, spanning more than 147 countries (UNCTAD, 2019). The majority have failed to achieve their stated objectives of broader economic development. In Africa, Farole (2011) found that most zones failed to generate significant linkages with their surrounding economies. In Asia, even China's SEZ program succeeded precisely because it invested heavily in human capital alongside physical infrastructure — this is the exception, not the rule. India's SEZ program has produced predominantly real estate developments with limited manufacturing. In Latin America, the maquiladora zones generated employment and export revenue but created a dependent economy with low skills, low wages, and limited spillover effects.</w:t>
+      </w:r>
+    </w:p>
+    <w:p>
+      <w:pPr>
+        <w:pStyle w:val="Heading3"/>
+      </w:pPr>
+      <w:r>
+        <w:t>79.2 The Konza Technopolis Case: Africa's Warning</w:t>
+      </w:r>
+    </w:p>
+    <w:p>
+      <w:r>
+        <w:t>Kenya's Konza Technopolis — "Silicon Savannah" — is the most relevant African case study. Conceived in 2008 as part of Kenya's Vision 2030, Konza was designed as a $14.6 billion smart city spanning 5,000 acres. As of 2025, the project has been widely characterized as a failure. The site remains largely empty. The National Data Centre operates below capacity. The causes are directly relevant: a human capital gap (the education system was not producing the specialized workforce required), an infrastructure-aspiration mismatch (physical infrastructure planned before institutional and human infrastructure), a disconnect from the existing economy (designed as a standalone hub rather than an organic extension), and imported expertise dependency (reliance on international consultants rather than developing local capacity). Konza is not an anomaly. It is the pattern that Algorapolis must be designed to prevent.</w:t>
+      </w:r>
+    </w:p>
+    <w:p>
+      <w:pPr>
+        <w:pStyle w:val="Heading3"/>
+      </w:pPr>
+      <w:r>
+        <w:t>79.3 The Core Failure</w:t>
+      </w:r>
+    </w:p>
+    <w:p>
+      <w:r>
+        <w:t>The most common failure of Special Economic Zones is the creation of infrastructure that grows faster than the human capacity required to operate it. This creates empty technology parks, underutilized industrial zones, imported expertise dependency, local unemployment despite investment, economic isolation, capital flight, and cultural alienation. Economists describe this as an Enclave Economy. The physical infrastructure succeeds. The human infrastructure fails. This is not a minor inefficiency — it is a structural failure that converts investment into liability. An empty technology park does not merely fail to generate returns; it consumes maintenance costs, occupies land, and creates political resentment.</w:t>
+      </w:r>
+    </w:p>
+    <w:p>
+      <w:pPr>
+        <w:pStyle w:val="Heading2"/>
+      </w:pPr>
+      <w:r>
+        <w:t>Section 80: The Human Infrastructure Principle</w:t>
+      </w:r>
+    </w:p>
+    <w:p>
+      <w:pPr>
+        <w:pStyle w:val="Heading3"/>
+      </w:pPr>
+      <w:r>
+        <w:t>80.1 The Principle</w:t>
+      </w:r>
+    </w:p>
+    <w:p>
+      <w:pPr>
+        <w:ind w:left="720"/>
+      </w:pPr>
+      <w:r>
+        <w:rPr>
+          <w:i/>
+        </w:rPr>
+        <w:t>Human infrastructure must be developed at the same pace as physical infrastructure.</w:t>
+      </w:r>
+    </w:p>
+    <w:p>
+      <w:r>
+        <w:t>Roads alone do not create civilization. Buildings alone do not create civilization. Technology alone does not create civilization. People create civilization. This principle is not merely aspirational. It must become a constitutional constraint — a formally verified condition that the Sovereign Logic Engine checks before authorizing any major infrastructure deployment.</w:t>
+      </w:r>
+    </w:p>
+    <w:p>
+      <w:pPr>
+        <w:pStyle w:val="Heading3"/>
+      </w:pPr>
+      <w:r>
+        <w:t>80.2 Defining Human Infrastructure</w:t>
+      </w:r>
+    </w:p>
+    <w:p>
+      <w:r>
+        <w:t>Human infrastructure encompasses seven dimensions: educational infrastructure (schools, vocational training, universities, continuing education), institutional infrastructure (governance capacity, rule of law, regulatory competence, judicial independence), health infrastructure (preventive care, mental health support, nutrition security), leadership infrastructure (pipelines for developing and succession-planning leaders), cultural infrastructure (shared narratives, rituals, symbols, civic practices), social infrastructure (trust networks, community organizations, civic participation), and technical infrastructure (workforce skills, engineering capability, maintenance capacity). Each dimension must be assessed, measured, and synchronized with physical infrastructure development.</w:t>
+      </w:r>
+    </w:p>
+    <w:p>
+      <w:pPr>
+        <w:pStyle w:val="Heading3"/>
+      </w:pPr>
+      <w:r>
+        <w:t>80.3 The Synchronization Constraint</w:t>
+      </w:r>
+    </w:p>
+    <w:p>
+      <w:r>
+        <w:t>The synchronization of human and physical infrastructure is not automatic. Physical infrastructure can be built in one to three years. Human infrastructure requires five to fifteen years to reach comparable maturity. Institutional infrastructure requires ten to thirty years to achieve stable self-governance. The implication is stark: any infrastructure program that does not begin human infrastructure development before physical construction is already behind. This structural asymmetry creates the Shenzhen Acceleration Risk.</w:t>
+      </w:r>
+    </w:p>
+    <w:p>
+      <w:pPr>
+        <w:pStyle w:val="Heading2"/>
+      </w:pPr>
+      <w:r>
+        <w:t>Section 81: The Shenzhen Acceleration Risk — When Development Outruns Society</w:t>
+      </w:r>
+    </w:p>
+    <w:p>
+      <w:pPr>
+        <w:pStyle w:val="Heading3"/>
+      </w:pPr>
+      <w:r>
+        <w:t>81.1 The Shenzhen Model: Success with Caveats</w:t>
+      </w:r>
+    </w:p>
+    <w:p>
+      <w:r>
+        <w:t>Shenzhen transformed from a fishing village of 30,000 into a megacity of over 17 million in less than forty years. But this model carries structural risks: physical development outpaced institutional and cultural development, creating a transient population with weak local identity; urban villages became enclaves within the enclave; ecological cost was enormous; and the dependency risk is real — a city that cannot sustain itself from internal capacity is not truly developed but is a platform dependent on external inputs.</w:t>
+      </w:r>
+    </w:p>
+    <w:p>
+      <w:pPr>
+        <w:pStyle w:val="Heading3"/>
+      </w:pPr>
+      <w:r>
+        <w:t>81.2 The Acceleration Risk Defined</w:t>
+      </w:r>
+    </w:p>
+    <w:p>
+      <w:r>
+        <w:t>The Shenzhen Acceleration Risk describes a general pattern: the faster physical infrastructure develops relative to human infrastructure, the more fragile the resulting system becomes. If development occurs faster than education, institutional maturity, cultural adaptation, leadership development, and ecological sustainability, then the system becomes dependent on external expertise. Dubai, Doha, and numerous Gulf cities exhibit the same pattern — gleaming skylines built by migrant labor populations who are legally and socially excluded from the prosperity they create.</w:t>
+      </w:r>
+    </w:p>
+    <w:p>
+      <w:pPr>
+        <w:pStyle w:val="Heading3"/>
+      </w:pPr>
+      <w:r>
+        <w:t>81.3 The Dubai Case: Prosperity Built on Exclusion</w:t>
+      </w:r>
+    </w:p>
+    <w:p>
+      <w:r>
+        <w:t>The Gulf states represent the most extreme manifestation. Dubai and Abu Dhabi built extraordinary infrastructure maintained by migrant workers governed by the Kafala system — a sponsorship regime creating structural exclusion across economic, legal, social, and political dimensions. The result is a civilization that appears successful but contains structural fractures that could prove catastrophic under stress. The COVID-19 pandemic revealed these fractures when migrant worker populations became infection epicenters.</w:t>
+      </w:r>
+    </w:p>
+    <w:p>
+      <w:pPr>
+        <w:pStyle w:val="Heading3"/>
+      </w:pPr>
+      <w:r>
+        <w:t>81.4 The Niger Delta: Resource Enclave and Conflict</w:t>
+      </w:r>
+    </w:p>
+    <w:p>
+      <w:r>
+        <w:t>Nigeria's Niger Delta produces oil generating over 90% of export earnings and 70% of government revenue, yet communities remain among the poorest. The mechanism is textbook enclave economics: multinational companies extract wealth that flows to the national government and foreign shareholders rather than local communities. This structural injustice fueled the Niger Delta insurgency. Klitgaard's corruption formula (C = M + D - A) explains why: the oil sector creates monopoly, discretion, and insufficient accountability.</w:t>
+      </w:r>
+    </w:p>
+    <w:p>
+      <w:pPr>
+        <w:pStyle w:val="Heading2"/>
+      </w:pPr>
+      <w:r>
+        <w:t>Section 82: Human Capital Synchronization</w:t>
+      </w:r>
+    </w:p>
+    <w:p>
+      <w:pPr>
+        <w:pStyle w:val="Heading3"/>
+      </w:pPr>
+      <w:r>
+        <w:t>82.1 The Synchronization Framework</w:t>
+      </w:r>
+    </w:p>
+    <w:p>
+      <w:r>
+        <w:t>Every major infrastructure project should be accompanied by a parallel human capital development program of equivalent scope and investment. The framework operates across five dimensions: education (schools matched with curricula and teachers), workforce (factories matched with skilled workers), institutions (government buildings matched with trained regulators), leadership (decision centers matched with succession plans), and culture (public spaces matched with shared narratives). Each dimension has a synchronization metric measuring whether human infrastructure keeps pace.</w:t>
+      </w:r>
+    </w:p>
+    <w:p>
+      <w:pPr>
+        <w:pStyle w:val="Heading3"/>
+      </w:pPr>
+      <w:r>
+        <w:t>82.2 The Pre-Development Assessment</w:t>
+      </w:r>
+    </w:p>
+    <w:p>
+      <w:r>
+        <w:t>Before any major infrastructure project, five assessments should be mandatory: a Workforce Readiness Audit, an Institutional Capacity Assessment, a Cultural Compatibility Review, a Dependency Analysis, and a Spillover Projection. No infrastructure project should be authorized without a satisfactory Human Infrastructure Readiness assessment, formally encoded in the SLE's constitutional constraints.</w:t>
+      </w:r>
+    </w:p>
+    <w:p>
+      <w:pPr>
+        <w:pStyle w:val="Heading3"/>
+      </w:pPr>
+      <w:r>
+        <w:t>82.3 The Synchronized Development Protocol</w:t>
+      </w:r>
+    </w:p>
+    <w:p>
+      <w:r>
+        <w:t>The protocol requires corresponding human infrastructure milestones for every physical milestone: site preparation begins when workforce training launches; foundation is laid when the first cohort is certified; structure is completed when operational workforce is available; systems are installed when maintenance workforce is trained; facility is operational when institutional governance is ready; full capacity is reached when self-sustaining local operation is verified. If human capital milestones fall behind physical milestones, construction pauses until synchronization is restored. This is the Human Capital Synchronization Constraint — as non-negotiable as any constitutional guardrail.</w:t>
+      </w:r>
+    </w:p>
+    <w:p>
+      <w:pPr>
+        <w:pStyle w:val="Heading2"/>
+      </w:pPr>
+      <w:r>
+        <w:t>Section 83: Civilizational Cohesion — Connected Diversity</w:t>
+      </w:r>
+    </w:p>
+    <w:p>
+      <w:pPr>
+        <w:pStyle w:val="Heading3"/>
+      </w:pPr>
+      <w:r>
+        <w:t>83.1 The Cohesion Imperative</w:t>
+      </w:r>
+    </w:p>
+    <w:p>
+      <w:r>
+        <w:t>Algorapolis seeks to prevent fragmentation through connected diversity. Communities may differ in language, culture, religion, traditions, economic specialization, and governance modalities, but they remain connected through constitutional principles, economic exchange, infrastructure networks, civic participation, knowledge exchange, and mobility. The Enclave Problem arises when diversity becomes disconnected — when communities differ not merely in culture and practice but in access to opportunity, agency, and dignity.</w:t>
+      </w:r>
+    </w:p>
+    <w:p>
+      <w:pPr>
+        <w:pStyle w:val="Heading3"/>
+      </w:pPr>
+      <w:r>
+        <w:t>83.2 The Singapore Model: Engineered Cohesion</w:t>
+      </w:r>
+    </w:p>
+    <w:p>
+      <w:r>
+        <w:t>Singapore's Ethnic Integration Policy (EIP), introduced in 1989, mandates balanced ethnic representation in public housing to prevent racial enclaves. This demonstrates that cohesion can be architected, reveals trade-offs (the EIP restricts housing choice), shows limits of physical integration (proximity does not guarantee interaction), and raises scalability questions. Algorapolis must learn: constitutional mechanisms preventing enclave formation are necessary but must be complemented by genuine connection.</w:t>
+      </w:r>
+    </w:p>
+    <w:p>
+      <w:pPr>
+        <w:pStyle w:val="Heading3"/>
+      </w:pPr>
+      <w:r>
+        <w:t>83.3 The Ujamaa Lesson: Cohesion Without Prosperity</w:t>
+      </w:r>
+    </w:p>
+    <w:p>
+      <w:r>
+        <w:t>Tanzania's Ujamaa succeeded in forging national unity from over 120 ethnic groups and promoting Swahili as a national language, but failed economically. Cohesion without prosperity is unsustainable. The lesson: cohesion and prosperity must be pursued simultaneously. Cohesion without prosperity is brittle. Prosperity without cohesion is hollow.</w:t>
+      </w:r>
+    </w:p>
+    <w:p>
+      <w:pPr>
+        <w:pStyle w:val="Heading3"/>
+      </w:pPr>
+      <w:r>
+        <w:t>83.4 The Civilizational Cohesion Index</w:t>
+      </w:r>
+    </w:p>
+    <w:p>
+      <w:r>
+        <w:t>The Civilizational Cohesion Index (CCI) measures six dimensions: economic cohesion (inequality, trade, mobility), social cohesion (trust, participation, identity), institutional cohesion (governance trust, justice access), cultural cohesion (diversity, exchange, tolerance), infrastructural cohesion (connectivity parity, service uniformity), and knowledge cohesion (educational parity, innovation diffusion). The CCI should be computable in real time through the National Digital Twin and trigger constitutional alarms when any dimension falls below minimum thresholds.</w:t>
+      </w:r>
+    </w:p>
+    <w:p>
+      <w:pPr>
+        <w:pStyle w:val="Heading2"/>
+      </w:pPr>
+      <w:r>
+        <w:t>Section 84: Enclave Typology — Seven Dimensions of Disconnection</w:t>
+      </w:r>
+    </w:p>
+    <w:p>
+      <w:pPr>
+        <w:pStyle w:val="Heading3"/>
+      </w:pPr>
+      <w:r>
+        <w:t>84.1 Geographic Enclaves</w:t>
+      </w:r>
+    </w:p>
+    <w:p>
+      <w:r>
+        <w:t>Physical separation between a developed zone and its surroundings — SEZs, gated communities, mining towns, greenfield smart cities. Countermeasure: Constitutional Unity Layer with SLE-enforced uniform compliance.</w:t>
+      </w:r>
+    </w:p>
+    <w:p>
+      <w:pPr>
+        <w:pStyle w:val="Heading3"/>
+      </w:pPr>
+      <w:r>
+        <w:t>84.2 Economic Enclaves</w:t>
+      </w:r>
+    </w:p>
+    <w:p>
+      <w:r>
+        <w:t>Prosperity concentrated without diffusion — oil extraction, mining, financial districts surrounded by poverty. Countermeasure: Economic Interdependence Layer with spillover thresholds, anti-extraction protocols, and mobility guarantees.</w:t>
+      </w:r>
+    </w:p>
+    <w:p>
+      <w:pPr>
+        <w:pStyle w:val="Heading3"/>
+      </w:pPr>
+      <w:r>
+        <w:t>84.3 Digital Enclaves</w:t>
+      </w:r>
+    </w:p>
+    <w:p>
+      <w:r>
+        <w:t>Fragmentation along informational lines — echo chambers, filter bubbles (Pariser, 2011), algorithmic isolation, platform governance. Countermeasure: Civic Identity Layer with Information Diversity Protocol and digital enclave detection algorithms.</w:t>
+      </w:r>
+    </w:p>
+    <w:p>
+      <w:pPr>
+        <w:pStyle w:val="Heading3"/>
+      </w:pPr>
+      <w:r>
+        <w:t>84.4 Cultural Enclaves</w:t>
+      </w:r>
+    </w:p>
+    <w:p>
+      <w:r>
+        <w:t>Identity preservation at the cost of connection. Cultural preservation is constitutionally protected (Section 69) but becomes enclave formation when it prevents civic participation and knowledge sharing. Countermeasure: Knowledge Exchange Layer with cultural impact assessment and the Swahili Model.</w:t>
+      </w:r>
+    </w:p>
+    <w:p>
+      <w:pPr>
+        <w:pStyle w:val="Heading3"/>
+      </w:pPr>
+      <w:r>
+        <w:t>84.5 Temporal Enclaves</w:t>
+      </w:r>
+    </w:p>
+    <w:p>
+      <w:r>
+        <w:t>Communities at different development speeds — regions with nineteenth-century infrastructure adjacent to smart cities, generational digital divides. Countermeasure: Circadian Governance Protocol (Section 24.4) and Multi-Temporal Interface Architecture.</w:t>
+      </w:r>
+    </w:p>
+    <w:p>
+      <w:pPr>
+        <w:pStyle w:val="Heading3"/>
+      </w:pPr>
+      <w:r>
+        <w:t>84.6 Corporate Enclaves</w:t>
+      </w:r>
+    </w:p>
+    <w:p>
+      <w:r>
+        <w:t>Corporate governance creating de facto enclaves — company towns, platform economies, private cities. Countermeasure: Constitutional Primacy Doctrine — no corporate entity may provide governance functions constitutionally reserved for democratic institutions.</w:t>
+      </w:r>
+    </w:p>
+    <w:p>
+      <w:pPr>
+        <w:pStyle w:val="Heading3"/>
+      </w:pPr>
+      <w:r>
+        <w:t>84.7 Orbital and Planetary Enclaves</w:t>
+      </w:r>
+    </w:p>
+    <w:p>
+      <w:r>
+        <w:t>Settlements on other planets with separate governance — the ultimate enclave risk. Countermeasure: Constitutional Portability — the framework operates identically regardless of physical location. Multi-planetary governance must be designed before settlements exist.</w:t>
+      </w:r>
+    </w:p>
+    <w:p>
+      <w:pPr>
+        <w:pStyle w:val="Heading2"/>
+      </w:pPr>
+      <w:r>
+        <w:t>Section 85: The Anti-Enclave Framework — Five Constitutional Layers</w:t>
+      </w:r>
+    </w:p>
+    <w:p>
+      <w:pPr>
+        <w:pStyle w:val="Heading3"/>
+      </w:pPr>
+      <w:r>
+        <w:t>85.1 Constitutional Unity Layer</w:t>
+      </w:r>
+    </w:p>
+    <w:p>
+      <w:r>
+        <w:t>Shared rights and responsibilities across all communities. The Four Guardrails and Six Human-Reserved Domains apply universally. No zone may operate under a different constitutional framework. Economic incentives may differ; constitutional rights may not.</w:t>
+      </w:r>
+    </w:p>
+    <w:p>
+      <w:pPr>
+        <w:pStyle w:val="Heading3"/>
+      </w:pPr>
+      <w:r>
+        <w:t>85.2 Economic Interdependence Layer</w:t>
+      </w:r>
+    </w:p>
+    <w:p>
+      <w:r>
+        <w:t>Spillover Thresholds requiring every economic zone to demonstrate minimum spillover ratios. Anti-Extraction Protocol monitoring for extraction without contribution. Mobility Guarantee preventing restriction based on identity or residence. No economic zone may operate as a closed system.</w:t>
+      </w:r>
+    </w:p>
+    <w:p>
+      <w:pPr>
+        <w:pStyle w:val="Heading3"/>
+      </w:pPr>
+      <w:r>
+        <w:t>85.3 Human Mobility Layer</w:t>
+      </w:r>
+    </w:p>
+    <w:p>
+      <w:r>
+        <w:t>Freedom of movement as a constitutional right. Universal credential recognition through Proof-of-Skill. Anti-Gating Protocol: no zone may impose barriers preventing citizens from entering, working, or living in any area. Barriers to human mobility are constitutional violations.</w:t>
+      </w:r>
+    </w:p>
+    <w:p>
+      <w:pPr>
+        <w:pStyle w:val="Heading3"/>
+      </w:pPr>
+      <w:r>
+        <w:t>85.4 Civic Identity Layer</w:t>
+      </w:r>
+    </w:p>
+    <w:p>
+      <w:r>
+        <w:t>Constitutional citizenship subscribing to the framework, not to any ethnic, religious, or regional identity. Multi-layered identity honoring all affiliations without requiring any to be primary. The Swahili Model: shared civic language coexisting with linguistic diversity. No community may require exclusive identity commitment.</w:t>
+      </w:r>
+    </w:p>
+    <w:p>
+      <w:pPr>
+        <w:pStyle w:val="Heading3"/>
+      </w:pPr>
+      <w:r>
+        <w:t>85.5 Knowledge Exchange Layer</w:t>
+      </w:r>
+    </w:p>
+    <w:p>
+      <w:r>
+        <w:t>Diamond Open Access for publicly funded research. Innovation Diffusion Protocol with mandatory reporting timeframes. Reverse Innovation: knowledge flowing from periphery to center. Cultural Knowledge Preservation: respecting indigenous data sovereignty. No zone may hoard knowledge essential for civilizational resilience.</w:t>
+      </w:r>
+    </w:p>
+    <w:p>
+      <w:pPr>
+        <w:pStyle w:val="Heading2"/>
+      </w:pPr>
+      <w:r>
+        <w:t>Section 86: The Human Infrastructure Index and the Enclave Equilibrium</w:t>
+      </w:r>
+    </w:p>
+    <w:p>
+      <w:pPr>
+        <w:pStyle w:val="Heading3"/>
+      </w:pPr>
+      <w:r>
+        <w:t>86.1 The Human Infrastructure Index</w:t>
+      </w:r>
+    </w:p>
+    <w:p>
+      <w:r>
+        <w:t>The Human Infrastructure Index (HII) is a composite metric measuring human capacity relative to physical infrastructure across seven dimensions: education readiness, technical capability, leadership depth, institutional maturity, workforce adaptability, social cohesion, and cultural resilience. No city, zone, or community should be considered developed unless both its physical infrastructure and its human infrastructure reach sustainable levels.</w:t>
+      </w:r>
+    </w:p>
+    <w:p>
+      <w:pPr>
+        <w:pStyle w:val="Heading3"/>
+      </w:pPr>
+      <w:r>
+        <w:t>86.2 The HII Threshold and Enforcement</w:t>
+      </w:r>
+    </w:p>
+    <w:p>
+      <w:r>
+        <w:t>The HII threshold is the minimum level at which a region can independently sustain its physical infrastructure without external expertise dependency. When HII falls below threshold, the SLE should flag the region as Human Infrastructure Deficient, pause new physical infrastructure development, redirect investment to human infrastructure, and publish the deficiency publicly. This directly addresses implementation realism: success is measured not by whether technology works initially but by whether the local community can sustain it independently.</w:t>
+      </w:r>
+    </w:p>
+    <w:p>
+      <w:pPr>
+        <w:pStyle w:val="Heading3"/>
+      </w:pPr>
+      <w:r>
+        <w:t>86.3 The Enclave Equilibrium</w:t>
+      </w:r>
+    </w:p>
+    <w:p>
+      <w:r>
+        <w:t>Algorapolis must optimize for prosperity, competence, participation, and cohesion simultaneously. Prosperity without participation produces plutocracy; competence without cohesion produces technocracy; participation without competence produces populism; cohesion without prosperity produces stagnation. The Enclave Equilibrium is the dynamic balance where all four are within acceptable range — a continuous process of adjustment monitored by the SLE.</w:t>
+      </w:r>
+    </w:p>
+    <w:p>
+      <w:pPr>
+        <w:pStyle w:val="Heading3"/>
+      </w:pPr>
+      <w:r>
+        <w:t>86.4 The Anti-Enclave Constitutional Amendment</w:t>
+      </w:r>
+    </w:p>
+    <w:p>
+      <w:pPr>
+        <w:ind w:left="720"/>
+      </w:pPr>
+      <w:r>
+        <w:rPr>
+          <w:i/>
+        </w:rPr>
+        <w:t>No zone, community, region, or settlement within the Algorapolis jurisdiction may develop physical, economic, or technological infrastructure that exceeds the human infrastructure capacity of its local population without a synchronization plan that demonstrates how human infrastructure will reach parity within a constitutionally defined timeframe. The Sovereign Logic Engine shall monitor the Human Infrastructure Index for all zones and shall have the authority to pause physical infrastructure development when HII falls below the minimum sustainable threshold. No enclave — geographic, economic, digital, cultural, temporal, or planetary — shall be exempt from the constitutional unity framework. Specialization is permitted; separation is not.</w:t>
+      </w:r>
+    </w:p>
+    <w:p>
+      <w:pPr>
+        <w:pStyle w:val="Heading3"/>
+      </w:pPr>
+      <w:r>
+        <w:t>86.5 Application to the Tanzania Pilot</w:t>
+      </w:r>
+    </w:p>
+    <w:p>
+      <w:r>
+        <w:t>The Tanzania pilot provides the first opportunity to implement the HII. Before any infrastructure deployment in pilot districts, a baseline HII assessment should be conducted. Success metrics should include HII improvement alongside physical infrastructure metrics. The measure of success is whether the local community can operate, maintain, adapt, and improve the infrastructure independently within five years.</w:t>
+      </w:r>
+    </w:p>
+    <w:p>
+      <w:pPr>
+        <w:pStyle w:val="Heading2"/>
+      </w:pPr>
+      <w:r>
+        <w:t>Section 87: The Collier Framework and Enclave Research Agenda</w:t>
+      </w:r>
+    </w:p>
+    <w:p>
+      <w:pPr>
+        <w:pStyle w:val="Heading3"/>
+      </w:pPr>
+      <w:r>
+        <w:t>87.1 Collier's Four Traps and the Anti-Enclave Framework</w:t>
+      </w:r>
+    </w:p>
+    <w:p>
+      <w:r>
+        <w:t>Paul Collier's four traps map directly onto enclave dynamics. The Conflict Trap: enclaves fuel conflict through inequality. The Natural Resource Trap: the resource curse is fundamentally an enclave problem. The Landlocked Trap: geographic enclave formation at the national level. The Bad Governance Trap: elites creating political enclaves. Algorapolis's Anti-Enclave Framework addresses all four: Constitutional Unity Layer for political enclaves, Economic Interdependence Layer for resource enclaves, Human Mobility Layer for geographic enclaves, and SLE constitutional compliance for governance enclaves.</w:t>
+      </w:r>
+    </w:p>
+    <w:p>
+      <w:pPr>
+        <w:pStyle w:val="Heading3"/>
+      </w:pPr>
+      <w:r>
+        <w:t>87.2 Priority Research Questions</w:t>
+      </w:r>
+    </w:p>
+    <w:p>
+      <w:r>
+        <w:t>Fourteen questions define the frontier: (1) What causal mechanisms transform successful zones into disconnected enclaves? (2) How can regions remain connected without assimilation? (3) How can human infrastructure growth match physical infrastructure growth? (4) What distinguishes Shenzhen's success from Konza's failure? (5) How can digital enclaves be detected without violating privacy? (6) Can the CCI be computed in real time? (7) How can multi-planetary civilizations avoid enclave fragmentation? (8) How can autonomy and unity be balanced? (9) How should human capital be treated as critical infrastructure? (10) What governance structures prevent economic and cultural isolation? (11) How can governance bridge temporal scale differences? (12) What strategies work for enclave reintegration? (13) How should Algorapolis address corporate enclaves? (14) How can excellence be encouraged without permitting concentration to become enclave formation?</w:t>
+      </w:r>
+    </w:p>
+    <w:p>
+      <w:pPr>
+        <w:pStyle w:val="Heading3"/>
+      </w:pPr>
+      <w:r>
+        <w:t>87.3 Proposed Case Studies</w:t>
+      </w:r>
+    </w:p>
+    <w:p>
+      <w:r>
+        <w:t>Eleven case studies are proposed: Konza Technopolis, Kenya; Niger Delta, Nigeria; Shenzhen, China; Singapore; Dubai and Gulf States; Ujamaa Villages, Tanzania; Estonia e-Residency; Zambia Copper Belt; NEOM, Saudi Arabia; Prospera, Honduras; and Mars Settlement (future). Each will analyze through the Algorapolis lens, apply the Matching Principle, and identify transferable lessons.</w:t>
+      </w:r>
+    </w:p>
+    <w:p>
+      <w:pPr>
+        <w:pStyle w:val="Heading3"/>
+      </w:pPr>
+      <w:r>
+        <w:t>87.4 Proposed Specification Amendments</w:t>
+      </w:r>
+    </w:p>
+    <w:p>
+      <w:r>
+        <w:t>Seven amendments are proposed: Add Section 1.6, "Enclave Formation as a Structural Failure Mode"; Add Section 7.5, "Anti-Enclave Constitutional Constraints"; Add Section 12.4, "The Human Infrastructure Index and Synchronization Constraint"; Add Section 15.6, "Human Infrastructure Monitoring via the Digital Twin"; Add Section 66.6, "The Anti-Enclave Framework as a Strategic Synthesis Component"; Amend the Four Guardrails to include "No enclave exemption"; Amend the Tanzania Pilot Specification to include HII baseline assessment and improvement metrics.</w:t>
+      </w:r>
+    </w:p>
+    <w:p>
+      <w:pPr>
+        <w:pStyle w:val="Heading2"/>
+      </w:pPr>
+      <w:r>
+        <w:t>Core Principle</w:t>
+      </w:r>
+    </w:p>
+    <w:p>
+      <w:pPr>
+        <w:ind w:left="720"/>
+      </w:pPr>
+      <w:r>
+        <w:rPr>
+          <w:i/>
+        </w:rPr>
+        <w:t>Civilization is not built by infrastructure alone. Civilization is built when infrastructure, institutions, knowledge, culture, and human capability grow together. Any system that develops one while neglecting the others risks becoming an enclave rather than a civilization.</w:t>
+      </w:r>
+    </w:p>
+    <w:p>
+      <w:pPr>
+        <w:pStyle w:val="Heading1"/>
+      </w:pPr>
+      <w:r>
+        <w:t>PART XV: LEGAL PLURALISM, FOOD SOVEREIGNTY, AND MULTI-TEMPORAL GOVERNANCE</w:t>
+      </w:r>
+    </w:p>
+    <w:p>
+      <w:r>
+        <w:rPr>
+          <w:sz w:val="22"/>
+        </w:rPr>
+        <w:t>This research initiative explores three foundational challenges that many governance systems either ignore or oversimplify: Legal Pluralism, Food Sovereignty, and Multi-Temporal Governance. Together they address one of the central questions of Algorapolis: How can a civilization coordinate millions of people without erasing local traditions, weakening food security, or allowing high-speed systems to dominate slower human processes?</w:t>
+      </w:r>
+    </w:p>
+    <w:p>
+      <w:r>
+        <w:rPr>
+          <w:sz w:val="22"/>
+        </w:rPr>
+        <w:t>This is not an abstract philosophical exercise. Tanzania, where Algorapolis originates, operates under at least three simultaneous legal traditions (customary, Islamic, and statutory law). Over 65% of its workforce depends on agriculture, yet farmers receive only 30-40% of the consumer price for their crops. And the country's digital transformation threatens to accelerate governance processes beyond the pace at which communities can meaningfully participate. Each of these challenges is real, present, and urgent.</w:t>
+      </w:r>
+    </w:p>
+    <w:p>
+      <w:pPr>
+        <w:pStyle w:val="Heading2"/>
+      </w:pPr>
+      <w:r>
+        <w:t>Section 88: Computable Legal Pluralism — Multiple Laws, One Constitutional Floor</w:t>
+      </w:r>
+    </w:p>
+    <w:p>
+      <w:pPr>
+        <w:pStyle w:val="Heading3"/>
+      </w:pPr>
+      <w:r>
+        <w:t>88.1 The Problem of Overlapping Legal Systems</w:t>
+      </w:r>
+    </w:p>
+    <w:p>
+      <w:r>
+        <w:rPr>
+          <w:sz w:val="22"/>
+        </w:rPr>
+        <w:t>Many societies operate under multiple legal systems simultaneously. Traditional Law-as-Code frameworks assume a single legal structure. Reality is more complex. Tanzania operates under at least three legal traditions: the formal statutory system derived from English common law, the customary law of over 120 ethnic groups (codified in the Local Customary Law Declaration Order of 1963), and Islamic law applied to Muslims in matters of personal status under the Kadhi's Courts Act of 1967. These systems overlap, conflict, and interact in ways that a single-hierarchy computational model cannot capture.</w:t>
+      </w:r>
+    </w:p>
+    <w:p>
+      <w:pPr>
+        <w:pStyle w:val="Heading3"/>
+      </w:pPr>
+      <w:r>
+        <w:t>88.2 The Constitutional Rights Layer</w:t>
+      </w:r>
+    </w:p>
+    <w:p>
+      <w:pPr>
+        <w:ind w:left="720" w:right="720"/>
+      </w:pPr>
+      <w:r>
+        <w:rPr>
+          <w:i/>
+          <w:color w:val="333333"/>
+          <w:sz w:val="22"/>
+        </w:rPr>
+        <w:t>Diversity of legal traditions may exist beneath a shared Constitutional Rights Layer. No legal system may violate human dignity, fundamental rights, constitutional protections, or equality before the law.</w:t>
+      </w:r>
+    </w:p>
+    <w:p>
+      <w:r>
+        <w:rPr>
+          <w:sz w:val="22"/>
+        </w:rPr>
+        <w:t>This principle draws directly from the African Charter on Human and Peoples' Rights (Banjul Charter, 1981), which uniquely combines individual rights with collective rights and duties. The margin of appreciation doctrine from the European Court of Human Rights provides a computational template: a universal floor with a tunable margin for cultural variation.</w:t>
+      </w:r>
+    </w:p>
+    <w:p>
+      <w:pPr>
+        <w:pStyle w:val="Heading3"/>
+      </w:pPr>
+      <w:r>
+        <w:t>88.3 Strong vs. Weak Legal Pluralism</w:t>
+      </w:r>
+    </w:p>
+    <w:p>
+      <w:r>
+        <w:rPr>
+          <w:sz w:val="22"/>
+        </w:rPr>
+        <w:t>John Griffiths' foundational 1986 article distinguished between weak (state law) pluralism, where the sovereign state recognizes multiple legal orders as subordinate to itself, and strong (deep) pluralism, where multiple legal orders exist and operate independently without requiring state recognition. Von Benda-Beckmann sharpened this distinction: deep pluralism assumes no preordained supremacy of state law, while state law pluralism is merely a management strategy by the state.</w:t>
+      </w:r>
+    </w:p>
+    <w:p>
+      <w:r>
+        <w:rPr>
+          <w:sz w:val="22"/>
+        </w:rPr>
+        <w:t>The implication for computation is critical. A computational system designed under the assumption of state law pluralism can use a single hierarchical conflict-resolution mechanism. A system designed for deep legal pluralism must accommodate genuinely parallel, non-hierarchical normative orders that may produce contradictory but equally valid legal conclusions. Algorapolis must be designed for deep pluralism, because the reality of African, Asian, and future multi-planetary governance demands it.</w:t>
+      </w:r>
+    </w:p>
+    <w:p>
+      <w:pPr>
+        <w:pStyle w:val="Heading3"/>
+      </w:pPr>
+      <w:r>
+        <w:t>88.4 Defeasible Logic for Legal Reasoning</w:t>
+      </w:r>
+    </w:p>
+    <w:p>
+      <w:r>
+        <w:rPr>
+          <w:sz w:val="22"/>
+        </w:rPr>
+        <w:t>Defeasible logic, developed by Donald Nute (1994) and extended by Guido Governatori and colleagues, provides the most complete formalism for legal reasoning with rules and exceptions. Unlike classical (monotonic) logic, defeasible logic allows conclusions to be withdrawn when new information or exceptions are encountered. This mirrors how legal rules actually work: they hold "all else being equal" and can be overridden by exceptions, contrary provisions, or stronger competing rules.</w:t>
+      </w:r>
+    </w:p>
+    <w:p>
+      <w:r>
+        <w:rPr>
+          <w:sz w:val="22"/>
+        </w:rPr>
+        <w:t>The three-tier rule structure consists of: (1) Strict rules, where the conclusion necessarily follows from the premises; (2) Defeasible rules, where the conclusion holds unless defeated by a competing rule; and (3) Defeaters, which prevent a conclusion from being drawn but do not establish the opposite. A superiority relation determines which of two conflicting rules prevails. Recent work (Governatori and Rotolo, 2023; Azam et al., 2025) has integrated defeasible logic with GDPR compliance and smart contracts on blockchain, demonstrating that the formalism is mature enough for practical governance systems.</w:t>
+      </w:r>
+    </w:p>
+    <w:p>
+      <w:pPr>
+        <w:pStyle w:val="Heading3"/>
+      </w:pPr>
+      <w:r>
+        <w:t>88.5 Paraconsistent Logic for Conflicting Legal Systems</w:t>
+      </w:r>
+    </w:p>
+    <w:p>
+      <w:r>
+        <w:rPr>
+          <w:sz w:val="22"/>
+        </w:rPr>
+        <w:t>In classical logic, the principle of explosion dictates that from a contradiction, any proposition follows. This is catastrophic for legal pluralism, where contradictions between coexisting legal systems are not anomalies but the normal state of affairs. Newton da Costa's C-systems (1974) and Graham Priest's Logic of Paradox (1979) provide formal logics where contradictions do not entail everything. In paraconsistent logic, contradictions are contained: the system can hold both A and not-A without being forced to accept arbitrary B.</w:t>
+      </w:r>
+    </w:p>
+    <w:p>
+      <w:r>
+        <w:rPr>
+          <w:sz w:val="22"/>
+        </w:rPr>
+        <w:t>The research frontier is significant: no existing formal system combines paraconsistent logic, deontic modalities, and defeasible reasoning. This unified system would be the theoretical foundation for computable legal pluralism and represents a novel research contribution that Algorapolis is uniquely positioned to develop.</w:t>
+      </w:r>
+    </w:p>
+    <w:p>
+      <w:pPr>
+        <w:pStyle w:val="Heading3"/>
+      </w:pPr>
+      <w:r>
+        <w:t>88.6 Legal Conflict Resolution Across Traditions</w:t>
+      </w:r>
+    </w:p>
+    <w:p>
+      <w:r>
+        <w:rPr>
+          <w:sz w:val="22"/>
+        </w:rPr>
+        <w:t>Three Latin maxims structure conflict resolution within a single legal hierarchy: lex superior derogat legi inferiori (superior law prevails), lex specialis derogat legi generali (specific law prevails), and lex posterior derogat legi priori (later law prevails). These work within a single hierarchy but fail in deep pluralism, where there is no agreed-upon hierarchy between coexisting legal orders.</w:t>
+      </w:r>
+    </w:p>
+    <w:p>
+      <w:r>
+        <w:rPr>
+          <w:sz w:val="22"/>
+        </w:rPr>
+        <w:t>Tanzania's system relies on the repugnancy clause, a colonial-era mechanism that excludes customary or Islamic law that is "repugnant to natural justice, equity and good conscience." South Africa provides a more progressive model: Section 211 of the 1996 Constitution recognizes customary law "subject to the Constitution," and the Recognition of Customary Marriages Act (1998) validated potentially polygynous customary marriages. Bolivia's 2009 Constitution (Article 190) is the most radical, making indigenous justice co-equal with ordinary justice. This is the closest existing model to Algorapolis's Constitutional Rights Layer.</w:t>
+      </w:r>
+    </w:p>
+    <w:p>
+      <w:pPr>
+        <w:pStyle w:val="Heading3"/>
+      </w:pPr>
+      <w:r>
+        <w:t>88.7 Nested Governance and Polycentric Architecture</w:t>
+      </w:r>
+    </w:p>
+    <w:p>
+      <w:r>
+        <w:rPr>
+          <w:sz w:val="22"/>
+        </w:rPr>
+        <w:t>Elinor Ostrom's polycentric governance framework, which Algorapolis already draws upon for its Module Map, provides theoretical tools for understanding how multiple decision-making centers can coexist. Real-world examples demonstrate that nested governance is possible: Canada's self-government agreements with First Nations, New Zealand's Te Awa Tupua Act (2017) granting legal personhood to the Whanganui River, the EU's subsidiarity principle, and Bolivia's plurinational state model.</w:t>
+      </w:r>
+    </w:p>
+    <w:p>
+      <w:pPr>
+        <w:pStyle w:val="Heading3"/>
+      </w:pPr>
+      <w:r>
+        <w:t>88.8 Technical Architecture for Legal Pluralism</w:t>
+      </w:r>
+    </w:p>
+    <w:p>
+      <w:r>
+        <w:rPr>
+          <w:sz w:val="22"/>
+        </w:rPr>
+        <w:t>A proposed layered architecture for the SLE's legal pluralism system consists of five layers: (1) Constitutional Floor, with hard-coded, eternally entrenched rights verified by formal methods; (2) Legal Tradition Modules, where each legal tradition is represented as a defeasible logic rule set with deontic operators; (3) Conflict Resolution Layer, applying the three lex maxims within traditions and the Constitutional Rights Layer between traditions; (4) CRDT Synchronization, enabling distributed legal state across offline communities; and (5) Multi-Ontology Database, where each legal tradition has its own conceptual ontology with shared concepts mapped through a bridging layer.</w:t>
+      </w:r>
+    </w:p>
+    <w:p>
+      <w:pPr>
+        <w:pStyle w:val="Heading2"/>
+      </w:pPr>
+      <w:r>
+        <w:t>Section 89: Agricultural Telemetry and Food Sovereignty — Seeing the Food System</w:t>
+      </w:r>
+    </w:p>
+    <w:p>
+      <w:pPr>
+        <w:pStyle w:val="Heading3"/>
+      </w:pPr>
+      <w:r>
+        <w:t>89.1 The Vulnerability of Food Producers</w:t>
+      </w:r>
+    </w:p>
+    <w:p>
+      <w:r>
+        <w:rPr>
+          <w:sz w:val="22"/>
+        </w:rPr>
+        <w:t>Food producers are among the most economically vulnerable participants within a civilization. Smallholder farmers in sub-Saharan Africa typically receive only 15-40% of the final consumer price for their crops, with the remaining 60-85% captured by intermediaries. In Tanzania, where agriculture employs approximately 65% of the workforce, maize farmers receive only 30-40% of the consumer price. The structural causes are information asymmetry, infrastructure gaps, storage deficits, fragmented production, and power asymmetry.</w:t>
+      </w:r>
+    </w:p>
+    <w:p>
+      <w:pPr>
+        <w:pStyle w:val="Heading3"/>
+      </w:pPr>
+      <w:r>
+        <w:t>89.2 The Food Sovereignty Principle</w:t>
+      </w:r>
+    </w:p>
+    <w:p>
+      <w:pPr>
+        <w:ind w:left="720" w:right="720"/>
+      </w:pPr>
+      <w:r>
+        <w:rPr>
+          <w:i/>
+          <w:color w:val="333333"/>
+          <w:sz w:val="22"/>
+        </w:rPr>
+        <w:t>A civilization that cannot see its food system cannot govern responsibly.</w:t>
+      </w:r>
+    </w:p>
+    <w:p>
+      <w:r>
+        <w:rPr>
+          <w:sz w:val="22"/>
+        </w:rPr>
+        <w:t>But visibility alone is not enough. The difference between food security and food sovereignty is critical. Food security asks: "Is there enough food?" Food sovereignty asks: "Who controls the food system?" Technology can serve food sovereignty or undermine it. The design challenge is to build agricultural telemetry systems that are structurally constrained to serve democratic food governance rather than mere efficiency optimization.</w:t>
+      </w:r>
+    </w:p>
+    <w:p>
+      <w:pPr>
+        <w:pStyle w:val="Heading3"/>
+      </w:pPr>
+      <w:r>
+        <w:t>89.3 Food Sovereignty Theory and International Law</w:t>
+      </w:r>
+    </w:p>
+    <w:p>
+      <w:r>
+        <w:rPr>
+          <w:sz w:val="22"/>
+        </w:rPr>
+        <w:t>The concept of food sovereignty was introduced by La Via Campesina at the 1996 World Food Summit, as a direct counter-narrative to the dominant food security paradigm. The Nyeleni Declaration (2007) articulated six pillars: focuses on food for people, values food providers, localizes food systems, puts control locally, builds knowledge and skills, and works with nature. The UN Declaration on the Rights of Peasants (UNDROP, 2018) is the first international instrument to explicitly recognize the right to food sovereignty (Article 15), applying to an estimated 1.2 billion people working in rural areas.</w:t>
+      </w:r>
+    </w:p>
+    <w:p>
+      <w:pPr>
+        <w:pStyle w:val="Heading3"/>
+      </w:pPr>
+      <w:r>
+        <w:t>89.4 Agricultural Telemetry: Soil, Climate, Satellite, and Water Intelligence</w:t>
+      </w:r>
+    </w:p>
+    <w:p>
+      <w:r>
+        <w:rPr>
+          <w:sz w:val="22"/>
+        </w:rPr>
+        <w:t>Low-cost sensor networks can make precision agriculture accessible to smallholders. Open-source platforms ranging from $5-200 per node can measure soil moisture, pH, temperature, and nutrient levels. LoRaWAN connectivity (15km+ range, $2-5 per node per year) enables rural deployment without cellular infrastructure. Sentinel-2 satellite imagery provides 10m resolution, 5-day revisit, free of charge, for NDVI-based crop monitoring. The Trans-African Hydro-Meteorological Observatory (TAHMO) is deploying 20,000 low-cost weather stations across Africa. SunCulture (Kenya) offers pay-as-you-go solar irrigation via M-Pesa at $12/month.</w:t>
+      </w:r>
+    </w:p>
+    <w:p>
+      <w:pPr>
+        <w:pStyle w:val="Heading3"/>
+      </w:pPr>
+      <w:r>
+        <w:t>89.5 Supply Chain Visibility and Middleman Extraction</w:t>
+      </w:r>
+    </w:p>
+    <w:p>
+      <w:r>
+        <w:rPr>
+          <w:sz w:val="22"/>
+        </w:rPr>
+        <w:t>Blockchain-based supply chain systems can create transparency from farm to consumer. IBM Food Trust reduced food traceability from 7 days to 2.2 seconds, but serves corporate buyer interests. Warehouse receipt systems in Tanzania (TWLB, 100+ licensed warehouses) allow farmers to use stored grain as loan collateral, but minimum deposit quantities exclude the poorest smallholders. The Ethiopia Commodity Exchange (ECX) increased price transparency but initially banned direct farmer trading, eroding quality premiums. The lesson: digital market infrastructure is necessary but insufficient; institutional reform and farmer capacity building are equally critical.</w:t>
+      </w:r>
+    </w:p>
+    <w:p>
+      <w:pPr>
+        <w:pStyle w:val="Heading3"/>
+      </w:pPr>
+      <w:r>
+        <w:t>89.6 Case Studies in Food Sovereignty</w:t>
+      </w:r>
+    </w:p>
+    <w:p>
+      <w:r>
+        <w:rPr>
+          <w:sz w:val="22"/>
+        </w:rPr>
+        <w:t>Brazil's Fome Zero (Zero Hunger) program combined conditional cash transfers with food purchase programs (PAA, PNAE) that require government institutions to buy from family farms. This is the world's best food sovereignty policy: it simultaneously addresses hunger, supports smallholder farmers, and preserves agricultural biodiversity. India's e-NAM integrated 1,000+ wholesale markets but has not eliminated middlemen; it has digitized them. Rwanda's land tenure reform, which titled 10.3 million parcels, demonstrates that secure land rights are a prerequisite for food sovereignty. Malawi's Farm Input Subsidy Programme consumed 50% of the agricultural budget, creating dependency and targeting failures: a warning that well-intentioned policies can become traps.</w:t>
+      </w:r>
+    </w:p>
+    <w:p>
+      <w:pPr>
+        <w:pStyle w:val="Heading3"/>
+      </w:pPr>
+      <w:r>
+        <w:t>89.7 Privacy and Data Sovereignty in Agriculture</w:t>
+      </w:r>
+    </w:p>
+    <w:p>
+      <w:r>
+        <w:rPr>
+          <w:sz w:val="22"/>
+        </w:rPr>
+        <w:t>The John Deere right-to-repair controversy (settled for $99M in 2025) exposed the tension between agricultural technology corporations and farmer data rights. The CARE principles (Collective Benefit, Authority to Control, Responsibility, Ethics) must take precedence over FAIR principles when conflicts arise. Zero-knowledge proofs, already part of Algorapolis's Privacy Sovereignty framework, can enable yield verification and insurance claims without exposing farmer data. This is a constitutional requirement: no farmer should be forced to surrender data sovereignty in exchange for agricultural services.</w:t>
+      </w:r>
+    </w:p>
+    <w:p>
+      <w:pPr>
+        <w:pStyle w:val="Heading3"/>
+      </w:pPr>
+      <w:r>
+        <w:t>89.8 SLE Integration and Constitutional Guardrails</w:t>
+      </w:r>
+    </w:p>
+    <w:p>
+      <w:r>
+        <w:rPr>
+          <w:sz w:val="22"/>
+        </w:rPr>
+        <w:t>Seven constitutional guardrails constrain the SLE's agricultural functions: Subsistence Priority, Smallholder Protection, Diversity, Transparency, Consent, Precautionary, and Non-Discrimination. The Balance Principle operates as hard constraints on SLE optimization: yield optimization is bounded by soil carbon requirements, Gini coefficient thresholds, and crop diversity minimums. A six-tier human override architecture ensures control: from individual farmer opt-out, through community override and regional review, to national sunset provisions, constitutional challenge, and emergency kill switch.</w:t>
+      </w:r>
+    </w:p>
+    <w:p>
+      <w:pPr>
+        <w:pStyle w:val="Heading2"/>
+      </w:pPr>
+      <w:r>
+        <w:t>Section 90: Multi-Temporal Governance — Fast Systems, Slow Wisdom</w:t>
+      </w:r>
+    </w:p>
+    <w:p>
+      <w:pPr>
+        <w:pStyle w:val="Heading3"/>
+      </w:pPr>
+      <w:r>
+        <w:t>90.1 The Problem of Temporal Mismatch</w:t>
+      </w:r>
+    </w:p>
+    <w:p>
+      <w:r>
+        <w:rPr>
+          <w:sz w:val="22"/>
+        </w:rPr>
+        <w:t>Civilizations operate across fundamentally different time scales: seconds (energy grids, traffic, cybersecurity), hours (logistics, emergency response), months (budgets, crop cycles), years (infrastructure, economic strategy), generations (culture, institutions, identity), and centuries (civilizational continuity, planetary stewardship). Modern digital systems naturally prioritize speed. The average stock holding period fell from 8 years (1960) to approximately 5 months (2020). The result is what Thomas Hylland Eriksen calls "the tyranny of the moment" and what Hartmut Rosa describes as "frenetic standstill": everything moving faster but nothing really changing.</w:t>
+      </w:r>
+    </w:p>
+    <w:p>
+      <w:pPr>
+        <w:pStyle w:val="Heading3"/>
+      </w:pPr>
+      <w:r>
+        <w:t>90.2 The Temporal Governance Principle</w:t>
+      </w:r>
+    </w:p>
+    <w:p>
+      <w:pPr>
+        <w:ind w:left="720" w:right="720"/>
+      </w:pPr>
+      <w:r>
+        <w:rPr>
+          <w:i/>
+          <w:color w:val="333333"/>
+          <w:sz w:val="22"/>
+        </w:rPr>
+        <w:t>Fast systems must not dominate slow wisdom.</w:t>
+      </w:r>
+    </w:p>
+    <w:p>
+      <w:r>
+        <w:rPr>
+          <w:sz w:val="22"/>
+        </w:rPr>
+        <w:t>This principle draws on Stewart Brand's pace layering framework: "The fast parts learn, propose, and absorb shocks; the slow parts remember, integrate, and constrain." When faster layers dominate slower ones, the system becomes brittle. When slower layers stifle faster ones, the system stagnates. Civilizational health depends on the proper relationship between temporal layers.</w:t>
+      </w:r>
+    </w:p>
+    <w:p>
+      <w:pPr>
+        <w:pStyle w:val="Heading3"/>
+      </w:pPr>
+      <w:r>
+        <w:t>90.3 Intergenerational Justice Theory</w:t>
+      </w:r>
+    </w:p>
+    <w:p>
+      <w:r>
+        <w:rPr>
+          <w:sz w:val="22"/>
+        </w:rPr>
+        <w:t>John Rawls's "just savings principle" (1971) holds that each generation has an obligation to preserve the conditions of justice for future generations. Derek Parfit's "Non-Identity Problem" (1984) reveals that policies creating a worse-off future population may not "harm" any specific individual, creating a paradox that demands impersonal moral reasoning. Edith Brown Weiss's three principles of intergenerational equity (1989) provide the most actionable framework: conservation of options (diversity of the resource base), conservation of quality (the planet no worse than received), and conservation of access (equitable access to the legacy of past generations).</w:t>
+      </w:r>
+    </w:p>
+    <w:p>
+      <w:pPr>
+        <w:pStyle w:val="Heading3"/>
+      </w:pPr>
+      <w:r>
+        <w:t>90.4 Real-World Experiments in Intergenerational Governance</w:t>
+      </w:r>
+    </w:p>
+    <w:p>
+      <w:r>
+        <w:rPr>
+          <w:sz w:val="22"/>
+        </w:rPr>
+        <w:t>Wales's Well-being of Future Generations Act (2015) is the most comprehensive legislation, placing a legal duty on 48 public bodies with 7 well-being goals and a Future Generations Commissioner. The first commissioner, Sophie Howe, successfully challenged the M4 relief road on climate grounds. Hungary's experience provides a warning: an independent Parliamentary Commissioner for Future Generations was established in 2007 but downgraded to a deputy role in 2012 under the Orban government, demonstrating the vulnerability of institutions that exist only in statute.</w:t>
+      </w:r>
+    </w:p>
+    <w:p>
+      <w:r>
+        <w:rPr>
+          <w:sz w:val="22"/>
+        </w:rPr>
+        <w:t>Japan's "Future Design" method, developed by Tatsuyoshi Saijo, asks citizens to imagine themselves in the year 2050 and deliberate from that future perspective. Results consistently show that the "imaginary future generations" group proposes more ambitious, long-term policies. A counter-intuitive finding: older adults are equally or more capable of long-term thinking when adopting this perspective. Age is not the determinant; perspective-taking is.</w:t>
+      </w:r>
+    </w:p>
+    <w:p>
+      <w:r>
+        <w:rPr>
+          <w:sz w:val="22"/>
+        </w:rPr>
+        <w:t>Israel's Commission for Future Generations (2001-2006) was abolished after a single term due to perceived conflict with democratic legitimacy. The lesson: future generations institutions face a fundamental legitimacy challenge and require constitutional entrenchment rather than mere legislative protection.</w:t>
+      </w:r>
+    </w:p>
+    <w:p>
+      <w:pPr>
+        <w:pStyle w:val="Heading3"/>
+      </w:pPr>
+      <w:r>
+        <w:t>90.5 The Temporal Layer Model</w:t>
+      </w:r>
+    </w:p>
+    <w:p>
+      <w:r>
+        <w:rPr>
+          <w:sz w:val="22"/>
+        </w:rPr>
+        <w:t>Drawing on Stewart Brand's six-layer pace layering framework, the Algorapolis temporal model consists of: Immediate (seconds to days, infrastructure operations), Operational (weeks to months, public administration), Strategic (years to decades, economic development), Constitutional (decades to centuries, fundamental governance rules), Cultural (centuries to millennia, identity and tradition), and Natural (millennia and beyond, ecological systems). Each layer operates on its own temporal logic, with temporal firewalls preventing faster layers from overriding slower layers' decisions.</w:t>
+      </w:r>
+    </w:p>
+    <w:p>
+      <w:pPr>
+        <w:pStyle w:val="Heading3"/>
+      </w:pPr>
+      <w:r>
+        <w:t>90.6 Cultural Preservation vs. Acceleration</w:t>
+      </w:r>
+    </w:p>
+    <w:p>
+      <w:r>
+        <w:rPr>
+          <w:sz w:val="22"/>
+        </w:rPr>
+        <w:t>UNESCO estimates 50-90% of the world's approximately 7,000 languages will be extinct by 2100, accelerated by digital monoculture. John Mbiti's distinction between sasa (the present, experienced time) and zamani (the deep past, into which sasa flows) reveals that African temporal concepts are not linear but accumulative: the zamani is not "gone" but forms the foundation upon which sasa rests. The Ubuntu philosophy extends temporal community to include ancestors and the unborn. The Haudenosaunee (Iroquois) Seventh Generation principle requires that decisions be considered for their impact seven generations forward. These are not primitive superstitions but sophisticated temporal governance frameworks that Algorapolis must accommodate.</w:t>
+      </w:r>
+    </w:p>
+    <w:p>
+      <w:pPr>
+        <w:pStyle w:val="Heading3"/>
+      </w:pPr>
+      <w:r>
+        <w:t>90.7 Temporal Equity and the Discount Rate Problem</w:t>
+      </w:r>
+    </w:p>
+    <w:p>
+      <w:r>
+        <w:rPr>
+          <w:sz w:val="22"/>
+        </w:rPr>
+        <w:t>The Stern-Nordhaus debate illustrates the stakes of temporal equity. Nicholas Stern's 2006 Review used a near-zero discount rate, yielding a social cost of carbon of approximately $159/ton and justifying aggressive climate action. William Nordhaus used a higher discount rate, yielding approximately $20/ton. The difference is not technical but ethical. Three landmark climate cases demonstrate courts beginning to enforce temporal equity: Urgenda v. Netherlands (2019), the first court order to reduce emissions; Juliana v. US (2015-present), challenging constitutional right to a stable climate; and Neubauer v. Germany (2021), where the Federal Constitutional Court held that imposing excessive emission burdens on future generations violates "intertemporal guarantees of liberty."</w:t>
+      </w:r>
+    </w:p>
+    <w:p>
+      <w:pPr>
+        <w:pStyle w:val="Heading3"/>
+      </w:pPr>
+      <w:r>
+        <w:t>90.8 The Temporal Rights Charter</w:t>
+      </w:r>
+    </w:p>
+    <w:p>
+      <w:r>
+        <w:rPr>
+          <w:sz w:val="22"/>
+        </w:rPr>
+        <w:t>The Temporal Rights Charter proposes six future generations rights: the right to a habitable planet, the right to constitutional continuity, the right to cultural inheritance, the right to unencumbered options, the right to representation, and the right to intergenerational redress. It also proposes five rights to slowness: the right to deliberation, the right to cultural time, the right to seasonal governance, the right to offline existence, and the right to constitutional patience.</w:t>
+      </w:r>
+    </w:p>
+    <w:p>
+      <w:pPr>
+        <w:pStyle w:val="Heading3"/>
+      </w:pPr>
+      <w:r>
+        <w:t>90.9 Slow Governance Safeguards</w:t>
+      </w:r>
+    </w:p>
+    <w:p>
+      <w:r>
+        <w:rPr>
+          <w:sz w:val="22"/>
+        </w:rPr>
+        <w:t>Tiered cooling-off periods mandate minimum deliberation: 48 hours for routine administrative decisions, 30 days for policy changes, 90 days for major legislation, one year plus referendum for constitutional amendments, and two years plus Future Generations review for decisions affecting future generations. Constitutional locks include eternity clauses (certain provisions cannot be amended), temporal locks (provisions locked for specified periods), double majorities (popular and regional), and sequential approval (two consecutive parliaments with an election in between).</w:t>
+      </w:r>
+    </w:p>
+    <w:p>
+      <w:pPr>
+        <w:pStyle w:val="Heading3"/>
+      </w:pPr>
+      <w:r>
+        <w:t>90.10 SLE Enforcement of Temporal Governance</w:t>
+      </w:r>
+    </w:p>
+    <w:p>
+      <w:r>
+        <w:rPr>
+          <w:sz w:val="22"/>
+        </w:rPr>
+        <w:t>The Sovereign Logic Engine enforces temporal governance constraints through: algorithmic speed limits (refusing to process certain decision types faster than the constitutional minimum), mandatory deliberation triggers (injecting waiting periods into decision workflows), future generations impact assessments (formal assessment of intergenerational impacts before major decisions), and temporal consistency checking (verifying that faster-layer decisions do not override slower-layer commitments).</w:t>
+      </w:r>
+    </w:p>
+    <w:p>
+      <w:pPr>
+        <w:pStyle w:val="Heading2"/>
+      </w:pPr>
+      <w:r>
+        <w:t>Section 91: The Triangular Architecture — How the Three Domains Interconnect</w:t>
+      </w:r>
+    </w:p>
+    <w:p>
+      <w:pPr>
+        <w:pStyle w:val="Heading3"/>
+      </w:pPr>
+      <w:r>
+        <w:t>91.1 Legal Pluralism and Food Sovereignty</w:t>
+      </w:r>
+    </w:p>
+    <w:p>
+      <w:r>
+        <w:rPr>
+          <w:sz w:val="22"/>
+        </w:rPr>
+        <w:t>Agricultural communities often operate under customary law, not statutory law. Land tenure, water rights, seed sovereignty, and market access are governed by legal traditions that differ from region to region. A food sovereignty system that ignores legal pluralism will impose one-size-fits-all rules on communities with fundamentally different legal frameworks. Conversely, a legal pluralism system that ignores food sovereignty may protect cultural traditions while failing to protect the material conditions that make cultural life possible.</w:t>
+      </w:r>
+    </w:p>
+    <w:p>
+      <w:pPr>
+        <w:pStyle w:val="Heading3"/>
+      </w:pPr>
+      <w:r>
+        <w:t>91.2 Food Sovereignty and Multi-Temporal Governance</w:t>
+      </w:r>
+    </w:p>
+    <w:p>
+      <w:r>
+        <w:rPr>
+          <w:sz w:val="22"/>
+        </w:rPr>
+        <w:t>Food systems operate on seasonal, annual, and generational cycles. Agricultural decisions cannot be optimized on quarterly timescales. Crop rotation, soil regeneration, seed saving, and breeding programs require multi-year horizons. A food sovereignty system that ignores temporal governance will be optimized for short-term yield at the expense of long-term soil health, biodiversity, and farmer autonomy.</w:t>
+      </w:r>
+    </w:p>
+    <w:p>
+      <w:pPr>
+        <w:pStyle w:val="Heading3"/>
+      </w:pPr>
+      <w:r>
+        <w:t>91.3 Multi-Temporal Governance and Legal Pluralism</w:t>
+      </w:r>
+    </w:p>
+    <w:p>
+      <w:r>
+        <w:rPr>
+          <w:sz w:val="22"/>
+        </w:rPr>
+        <w:t>Different legal traditions operate on different temporal scales. Customary law evolves slowly, through precedent and practice accumulated over generations. Statutory law can change rapidly, through legislative action. A multi-temporal governance system that ignores legal pluralism will assume a single legal tempo. A legal pluralism system that ignores temporal governance will treat all legal traditions as if they operate on the same timescale.</w:t>
+      </w:r>
+    </w:p>
+    <w:p>
+      <w:pPr>
+        <w:pStyle w:val="Heading3"/>
+      </w:pPr>
+      <w:r>
+        <w:t>91.4 The Core Principle</w:t>
+      </w:r>
+    </w:p>
+    <w:p>
+      <w:pPr>
+        <w:ind w:left="720" w:right="720"/>
+      </w:pPr>
+      <w:r>
+        <w:rPr>
+          <w:i/>
+          <w:color w:val="333333"/>
+          <w:sz w:val="22"/>
+        </w:rPr>
+        <w:t>A civilization is not merely a system that governs people. It is a system that preserves diversity (Legal Pluralism), sustains life (Food Sovereignty), and coordinates across generations (Multi-Temporal Governance).</w:t>
+      </w:r>
+    </w:p>
+    <w:p>
+      <w:pPr>
+        <w:pStyle w:val="Heading2"/>
+      </w:pPr>
+      <w:r>
+        <w:t>Section 92: Priority Research Questions for Legal Pluralism, Food Sovereignty, and Multi-Temporal Governance</w:t>
+      </w:r>
+    </w:p>
+    <w:p>
+      <w:pPr>
+        <w:pStyle w:val="ListBullet"/>
+      </w:pPr>
+      <w:r>
+        <w:t>1. Can multiple legal systems be formally verified under one constitutional framework? What formal methods (LTL/CTL model checking) are appropriate?</w:t>
+      </w:r>
+    </w:p>
+    <w:p>
+      <w:pPr>
+        <w:pStyle w:val="ListBullet"/>
+      </w:pPr>
+      <w:r>
+        <w:t>2. How can local traditions remain autonomous without fragmenting society? What is the computational boundary between autonomy and isolation?</w:t>
+      </w:r>
+    </w:p>
+    <w:p>
+      <w:pPr>
+        <w:pStyle w:val="ListBullet"/>
+      </w:pPr>
+      <w:r>
+        <w:t>3. How can food systems become visible in real time without creating surveillance agriculture?</w:t>
+      </w:r>
+    </w:p>
+    <w:p>
+      <w:pPr>
+        <w:pStyle w:val="ListBullet"/>
+      </w:pPr>
+      <w:r>
+        <w:t>4. Can agricultural telemetry reduce resource waste and food insecurity without increasing farmer dependency on technology systems?</w:t>
+      </w:r>
+    </w:p>
+    <w:p>
+      <w:pPr>
+        <w:pStyle w:val="ListBullet"/>
+      </w:pPr>
+      <w:r>
+        <w:t>5. How should governance systems operate across multiple time horizons simultaneously?</w:t>
+      </w:r>
+    </w:p>
+    <w:p>
+      <w:pPr>
+        <w:pStyle w:val="ListBullet"/>
+      </w:pPr>
+      <w:r>
+        <w:t>6. How can future generations be represented in present decisions? What institutional models are most robust against political rollback?</w:t>
+      </w:r>
+    </w:p>
+    <w:p>
+      <w:pPr>
+        <w:pStyle w:val="ListBullet"/>
+      </w:pPr>
+      <w:r>
+        <w:t>7. What decisions should never be accelerated? How can we formally specify non-accelerable decision categories in the SLE?</w:t>
+      </w:r>
+    </w:p>
+    <w:p>
+      <w:pPr>
+        <w:pStyle w:val="ListBullet"/>
+      </w:pPr>
+      <w:r>
+        <w:t>8. How can computational governance remain compatible with human cultural evolution?</w:t>
+      </w:r>
+    </w:p>
+    <w:p>
+      <w:pPr>
+        <w:pStyle w:val="ListBullet"/>
+      </w:pPr>
+      <w:r>
+        <w:t>9. How should paraconsistent logic, deontic modalities, and defeasible reasoning be unified into a single formal system for computable legal pluralism?</w:t>
+      </w:r>
+    </w:p>
+    <w:p>
+      <w:pPr>
+        <w:pStyle w:val="ListBullet"/>
+      </w:pPr>
+      <w:r>
+        <w:t>10. What is the minimum spillover ratio that prevents economic enclave formation in agricultural value chains?</w:t>
+      </w:r>
+    </w:p>
+    <w:p>
+      <w:pPr>
+        <w:pStyle w:val="ListBullet"/>
+      </w:pPr>
+      <w:r>
+        <w:t>11. How can the National Digital Twin represent temporal layers without privileging present conditions?</w:t>
+      </w:r>
+    </w:p>
+    <w:p>
+      <w:pPr>
+        <w:pStyle w:val="ListBullet"/>
+      </w:pPr>
+      <w:r>
+        <w:t>12. How should the Constitutional Rights Layer accommodate the African Charter's collective rights framework alongside individual rights?</w:t>
+      </w:r>
+    </w:p>
+    <w:p>
+      <w:pPr>
+        <w:pStyle w:val="ListBullet"/>
+      </w:pPr>
+      <w:r>
+        <w:t>13. Can the Circadian Governance Protocol (Section 24.4) be extended to include seasonal governance for agricultural communities?</w:t>
+      </w:r>
+    </w:p>
+    <w:p>
+      <w:pPr>
+        <w:pStyle w:val="ListBullet"/>
+      </w:pPr>
+      <w:r>
+        <w:t>14. How should farmer data sovereignty interact with the National Digital Twin's need for comprehensive agricultural data?</w:t>
+      </w:r>
+    </w:p>
+    <w:p>
+      <w:pPr>
+        <w:pStyle w:val="ListBullet"/>
+      </w:pPr>
+      <w:r>
+        <w:t>15. What constitutional entrenchment mechanisms can protect future generations institutions from political rollback?</w:t>
+      </w:r>
+    </w:p>
+    <w:p>
+      <w:pPr>
+        <w:pStyle w:val="Heading2"/>
+      </w:pPr>
+      <w:r>
+        <w:t>Section 93: Proposed Specification Amendments</w:t>
+      </w:r>
+    </w:p>
+    <w:p>
+      <w:pPr>
+        <w:pStyle w:val="Heading3"/>
+      </w:pPr>
+      <w:r>
+        <w:t>93.1 Constitutional Rights Layer (New Section)</w:t>
+      </w:r>
+    </w:p>
+    <w:p>
+      <w:r>
+        <w:rPr>
+          <w:sz w:val="22"/>
+        </w:rPr>
+        <w:t>A Constitutional Rights Layer shall be established as a universal floor beneath which no legal tradition may operate. The layer shall include: non-negotiable rights derived from the ICCPR, ICESCR, and ACHPR; a margin of appreciation allowing cultural variation; collective rights and duties (per the Banjul Charter); and eternally entrenched prohibitions (genocide, slavery, torture, systematic discrimination).</w:t>
+      </w:r>
+    </w:p>
+    <w:p>
+      <w:pPr>
+        <w:pStyle w:val="Heading3"/>
+      </w:pPr>
+      <w:r>
+        <w:t>93.2 Legal Pluralism Module (Section 7 Extension)</w:t>
+      </w:r>
+    </w:p>
+    <w:p>
+      <w:r>
+        <w:rPr>
+          <w:sz w:val="22"/>
+        </w:rPr>
+        <w:t>The SLE Module Map shall include a Legal Pluralism Module that: encodes each legal tradition as a defeasible logic rule set; applies the three lex maxims for intra-tradition conflicts; applies the Constitutional Rights Layer for inter-tradition conflicts; and uses CRDT synchronization for distributed legal state.</w:t>
+      </w:r>
+    </w:p>
+    <w:p>
+      <w:pPr>
+        <w:pStyle w:val="Heading3"/>
+      </w:pPr>
+      <w:r>
+        <w:t>93.3 Food Sovereignty Layer (New Section)</w:t>
+      </w:r>
+    </w:p>
+    <w:p>
+      <w:r>
+        <w:rPr>
+          <w:sz w:val="22"/>
+        </w:rPr>
+        <w:t>A Food Sovereignty Layer shall be established within the National Digital Twin that: provides real-time visibility of the national food system; operates under seven constitutional guardrails (Subsistence Priority, Smallholder Protection, Diversity, Transparency, Consent, Precautionary, Non-Discrimination); requires farmer data sovereignty (CARE principles over FAIR); and includes six-tier human override architecture.</w:t>
+      </w:r>
+    </w:p>
+    <w:p>
+      <w:pPr>
+        <w:pStyle w:val="Heading3"/>
+      </w:pPr>
+      <w:r>
+        <w:t>93.4 Multi-Temporal Architecture (Section 24 Extension)</w:t>
+      </w:r>
+    </w:p>
+    <w:p>
+      <w:r>
+        <w:rPr>
+          <w:sz w:val="22"/>
+        </w:rPr>
+        <w:t>The Circadian Governance Protocol (Section 24.4) shall be extended to: five temporal layers (Real-time, Operational, Regulatory, Strategic, Constitutional); temporal firewalls preventing faster layers from overriding slower layers; algorithmic speed limits on non-accelerable decisions; and mandatory deliberation periods by decision type.</w:t>
+      </w:r>
+    </w:p>
+    <w:p>
+      <w:pPr>
+        <w:pStyle w:val="Heading3"/>
+      </w:pPr>
+      <w:r>
+        <w:t>93.5 Future Generations Protocol (New Section)</w:t>
+      </w:r>
+    </w:p>
+    <w:p>
+      <w:r>
+        <w:rPr>
+          <w:sz w:val="22"/>
+        </w:rPr>
+        <w:t>A Future Generations Protocol shall be established that: creates a Future Generations Commissioner with constitutional entrenchment (learning from Hungary/Israel); mandates intergenerational impact assessments for major decisions; establishes the Temporal Rights Charter as constitutional law; and requires Japan-style Future Design exercises for long-term planning.</w:t>
+      </w:r>
+    </w:p>
+    <w:p>
+      <w:pPr>
+        <w:pStyle w:val="Heading3"/>
+      </w:pPr>
+      <w:r>
+        <w:t>93.6 Tanzania Pilot Amendment (Section 46 Extension)</w:t>
+      </w:r>
+    </w:p>
+    <w:p>
+      <w:r>
+        <w:rPr>
+          <w:sz w:val="22"/>
+        </w:rPr>
+        <w:t>The Tanzania Pilot Specification shall be amended to: test the Legal Pluralism Module in Primary Courts and Kadhi's Courts; pilot the Food Sovereignty Layer in SAGCOT corridor communities; implement multi-temporal governance in local government decision processes; and establish a Future Generations Commissioner for Tanzania.</w:t>
+      </w:r>
+    </w:p>
+    <w:p>
+      <w:pPr>
+        <w:pStyle w:val="Heading3"/>
+      </w:pPr>
+      <w:r>
+        <w:t>93.7 Civilizational Cohesion Index Extension</w:t>
+      </w:r>
+    </w:p>
+    <w:p>
+      <w:r>
+        <w:rPr>
+          <w:sz w:val="22"/>
+        </w:rPr>
+        <w:t>The Civilizational Cohesion Index (proposed in Section 86) shall be extended to include: Legal Cohesion (inter-tradition conflict frequency and resolution), Food System Cohesion (farmer share of consumer price and food system dependency ratios), and Temporal Cohesion (pace-layer alignment and temporal equity indicators).</w:t>
       </w:r>
     </w:p>
     <w:sectPr>

</xml_diff>